<commit_message>
Clase 2 Silvia corregida: laminas y numeros de Salesforce los pide DIANA (relacion ejecutiva) - Breagh solo pide el video nocturno y reenvia si le llega material
Co-Authored-By: Claude Fable 5 <noreply@anthropic.com>
</commit_message>
<xml_diff>
--- a/recursos/personalizados/SILVIA/CLASE_2_GUION_BREAGH.docx
+++ b/recursos/personalizados/SILVIA/CLASE_2_GUION_BREAGH.docx
@@ -396,29 +396,7 @@
         <w:rPr>
           <w:sz w:val="20"/>
         </w:rPr>
-        <w:t>Su PRESENTACION (las laminas que ya tiene, en el idioma que esten) - la necesitamos ESTA SEMANA para escribir su guion hablado.</w:t>
-      </w:r>
-    </w:p>
-    <w:p>
-      <w:pPr>
-        <w:pStyle w:val="ListBullet"/>
-      </w:pPr>
-      <w:r>
-        <w:rPr>
-          <w:sz w:val="20"/>
-        </w:rPr>
-        <w:t>Sus NUMEROS DE PIPELINE en Salesforce (oportunidades, propuestas activas, diagnosticos) - llenan los espacios de sus respuestas del Q&amp;A.</w:t>
-      </w:r>
-    </w:p>
-    <w:p>
-      <w:pPr>
-        <w:pStyle w:val="ListBullet"/>
-      </w:pPr>
-      <w:r>
-        <w:rPr>
-          <w:sz w:val="20"/>
-        </w:rPr>
-        <w:t>El video nocturno de HOY (su primera noche con la rutina completa).</w:t>
+        <w:t>El video nocturno de HOY (su primera noche con la rutina completa) - que te llegue esta misma noche.</w:t>
       </w:r>
     </w:p>
     <w:p>
@@ -428,7 +406,7 @@
           <w:i/>
           <w:sz w:val="18"/>
         </w:rPr>
-        <w:t>Nota: Diana tambien se los va a pedir directamente - tu solo refuerzas que sin ese material no se puede escribir el guion grande.</w:t>
+        <w:t>Nota: las laminas de su presentacion y los numeros de Salesforce se los pide DIANA directamente (relacion ejecutiva) - si Silvia te los menciona o te los envia a ti, reenviaselos a Diana ese mismo dia.</w:t>
       </w:r>
     </w:p>
     <w:p>

</xml_diff>

<commit_message>
Clase 2 Silvia: bloque explicito TAREA PARA EL JUEVES (shadowing diario, 2 videos nocturnos, repaso 10 terminos con mini-quiz de apertura, oido) con meta medible
Co-Authored-By: Claude Fable 5 <noreply@anthropic.com>
</commit_message>
<xml_diff>
--- a/recursos/personalizados/SILVIA/CLASE_2_GUION_BREAGH.docx
+++ b/recursos/personalizados/SILVIA/CLASE_2_GUION_BREAGH.docx
@@ -385,6 +385,70 @@
           <w:color w:val="152A4A"/>
           <w:sz w:val="22"/>
         </w:rPr>
+        <w:t>TAREA PARA EL JUEVES (se la dejas dicha y escrita por WhatsApp al cerrar)</w:t>
+      </w:r>
+    </w:p>
+    <w:p>
+      <w:pPr>
+        <w:pStyle w:val="ListBullet"/>
+      </w:pPr>
+      <w:r>
+        <w:rPr>
+          <w:sz w:val="20"/>
+        </w:rPr>
+        <w:t>Esta noche y manana: shadowing del intro con tus audios (15-20 min cada dia).</w:t>
+      </w:r>
+    </w:p>
+    <w:p>
+      <w:pPr>
+        <w:pStyle w:val="ListBullet"/>
+      </w:pPr>
+      <w:r>
+        <w:rPr>
+          <w:sz w:val="20"/>
+        </w:rPr>
+        <w:t>Video de 30-60 seg diciendo el intro - uno esta noche y otro manana en la noche (2 videos antes del jueves).</w:t>
+      </w:r>
+    </w:p>
+    <w:p>
+      <w:pPr>
+        <w:pStyle w:val="ListBullet"/>
+      </w:pPr>
+      <w:r>
+        <w:rPr>
+          <w:sz w:val="20"/>
+        </w:rPr>
+        <w:t>Repasar los 10 terminos del Banco A en voz alta (5 min al dia) - el jueves abren la clase con el mini-quiz.</w:t>
+      </w:r>
+    </w:p>
+    <w:p>
+      <w:pPr>
+        <w:pStyle w:val="ListBullet"/>
+      </w:pPr>
+      <w:r>
+        <w:rPr>
+          <w:sz w:val="20"/>
+        </w:rPr>
+        <w:t>1 video corto en ingles con subtitulos cada dia (Veolia o National Geographic).</w:t>
+      </w:r>
+    </w:p>
+    <w:p>
+      <w:r>
+        <w:rPr>
+          <w:b/>
+          <w:i w:val="0"/>
+          <w:sz w:val="20"/>
+        </w:rPr>
+        <w:t>Meta para el jueves: leer el intro completo con claridad SIN trabarse + los 10 terminos reconocidos al vuelo.</w:t>
+      </w:r>
+    </w:p>
+    <w:p>
+      <w:r>
+        <w:rPr>
+          <w:b/>
+          <w:color w:val="152A4A"/>
+          <w:sz w:val="22"/>
+        </w:rPr>
         <w:t>LO QUE DEBES PEDIRLE A SILVIA EN ESTA CLASE</w:t>
       </w:r>
     </w:p>

</xml_diff>